<commit_message>
Minor Update to Video Player instructions
</commit_message>
<xml_diff>
--- a/HCRO/To_Play_Video.docx
+++ b/HCRO/To_Play_Video.docx
@@ -33,7 +33,7 @@
           <w:szCs w:val="72"/>
         </w:rPr>
         <w:drawing>
-          <wp:anchor distT="0" distB="0" distL="114300" distR="114300" simplePos="0" relativeHeight="251658240" behindDoc="0" locked="0" layoutInCell="1" allowOverlap="1" wp14:anchorId="4B815331" wp14:editId="58D6B98A">
+          <wp:anchor distT="0" distB="0" distL="114300" distR="114300" simplePos="0" relativeHeight="251658240" behindDoc="0" locked="0" layoutInCell="1" allowOverlap="1" wp14:anchorId="4B815331" wp14:editId="24706642">
             <wp:simplePos x="0" y="0"/>
             <wp:positionH relativeFrom="column">
               <wp:posOffset>0</wp:posOffset>
@@ -373,7 +373,7 @@
           <w:szCs w:val="40"/>
         </w:rPr>
         <w:drawing>
-          <wp:inline distT="0" distB="0" distL="0" distR="0" wp14:anchorId="403EC7E4" wp14:editId="4885882D">
+          <wp:inline distT="0" distB="0" distL="0" distR="0" wp14:anchorId="403EC7E4" wp14:editId="6CC6DF46">
             <wp:extent cx="2507516" cy="2098884"/>
             <wp:effectExtent l="0" t="0" r="0" b="0"/>
             <wp:docPr id="439494789" name="Picture 3"/>

</xml_diff>